<commit_message>
Modificación errata documento word
</commit_message>
<xml_diff>
--- a/Docs/Documentación-ProyectoFQP.docx
+++ b/Docs/Documentación-ProyectoFQP.docx
@@ -1,21 +1,19 @@
 
 <file path=word/document.xml><?xml version="1.0" encoding="utf-8"?>
-<w:document xmlns:wpc="http://schemas.microsoft.com/office/word/2010/wordprocessingCanvas" xmlns:cx="http://schemas.microsoft.com/office/drawing/2014/chartex" xmlns:cx1="http://schemas.microsoft.com/office/drawing/2015/9/8/chartex" xmlns:mc="http://schemas.openxmlformats.org/markup-compatibility/2006" xmlns:o="urn:schemas-microsoft-com:office:office" xmlns:r="http://schemas.openxmlformats.org/officeDocument/2006/relationships" xmlns:m="http://schemas.openxmlformats.org/officeDocument/2006/math" xmlns:v="urn:schemas-microsoft-com:vml" xmlns:wp14="http://schemas.microsoft.com/office/word/2010/wordprocessingDrawing" xmlns:wp="http://schemas.openxmlformats.org/drawingml/2006/wordprocessingDrawing" xmlns:w10="urn:schemas-microsoft-com:office:word" xmlns:w="http://schemas.openxmlformats.org/wordprocessingml/2006/main" xmlns:w14="http://schemas.microsoft.com/office/word/2010/wordml" xmlns:w15="http://schemas.microsoft.com/office/word/2012/wordml" xmlns:w16se="http://schemas.microsoft.com/office/word/2015/wordml/symex" xmlns:wpg="http://schemas.microsoft.com/office/word/2010/wordprocessingGroup" xmlns:wpi="http://schemas.microsoft.com/office/word/2010/wordprocessingInk" xmlns:wne="http://schemas.microsoft.com/office/word/2006/wordml" xmlns:wps="http://schemas.microsoft.com/office/word/2010/wordprocessingShape" mc:Ignorable="w14 w15 w16se wp14">
+<w:document xmlns:wpc="http://schemas.microsoft.com/office/word/2010/wordprocessingCanvas" xmlns:cx="http://schemas.microsoft.com/office/drawing/2014/chartex" xmlns:cx1="http://schemas.microsoft.com/office/drawing/2015/9/8/chartex" xmlns:cx2="http://schemas.microsoft.com/office/drawing/2015/10/21/chartex" xmlns:cx3="http://schemas.microsoft.com/office/drawing/2016/5/9/chartex" xmlns:cx4="http://schemas.microsoft.com/office/drawing/2016/5/10/chartex" xmlns:cx5="http://schemas.microsoft.com/office/drawing/2016/5/11/chartex" xmlns:cx6="http://schemas.microsoft.com/office/drawing/2016/5/12/chartex" xmlns:cx7="http://schemas.microsoft.com/office/drawing/2016/5/13/chartex" xmlns:cx8="http://schemas.microsoft.com/office/drawing/2016/5/14/chartex" xmlns:mc="http://schemas.openxmlformats.org/markup-compatibility/2006" xmlns:aink="http://schemas.microsoft.com/office/drawing/2016/ink" xmlns:am3d="http://schemas.microsoft.com/office/drawing/2017/model3d" xmlns:o="urn:schemas-microsoft-com:office:office" xmlns:oel="http://schemas.microsoft.com/office/2019/extlst" xmlns:r="http://schemas.openxmlformats.org/officeDocument/2006/relationships" xmlns:m="http://schemas.openxmlformats.org/officeDocument/2006/math" xmlns:v="urn:schemas-microsoft-com:vml" xmlns:wp14="http://schemas.microsoft.com/office/word/2010/wordprocessingDrawing" xmlns:wp="http://schemas.openxmlformats.org/drawingml/2006/wordprocessingDrawing" xmlns:w10="urn:schemas-microsoft-com:office:word" xmlns:w="http://schemas.openxmlformats.org/wordprocessingml/2006/main" xmlns:w14="http://schemas.microsoft.com/office/word/2010/wordml" xmlns:w15="http://schemas.microsoft.com/office/word/2012/wordml" xmlns:w16cex="http://schemas.microsoft.com/office/word/2018/wordml/cex" xmlns:w16cid="http://schemas.microsoft.com/office/word/2016/wordml/cid" xmlns:w16="http://schemas.microsoft.com/office/word/2018/wordml" xmlns:w16sdtdh="http://schemas.microsoft.com/office/word/2020/wordml/sdtdatahash" xmlns:w16se="http://schemas.microsoft.com/office/word/2015/wordml/symex" xmlns:wpg="http://schemas.microsoft.com/office/word/2010/wordprocessingGroup" xmlns:wpi="http://schemas.microsoft.com/office/word/2010/wordprocessingInk" xmlns:wne="http://schemas.microsoft.com/office/word/2006/wordml" xmlns:wps="http://schemas.microsoft.com/office/word/2010/wordprocessingShape" mc:Ignorable="w14 w15 w16se w16cid w16 w16cex w16sdtdh wp14">
   <w:body>
     <w:sdt>
       <w:sdtPr>
+        <w:rPr>
+          <w:rFonts w:eastAsiaTheme="minorHAnsi"/>
+          <w:lang w:eastAsia="en-US"/>
+        </w:rPr>
         <w:id w:val="1412428119"/>
         <w:docPartObj>
           <w:docPartGallery w:val="Cover Pages"/>
           <w:docPartUnique/>
         </w:docPartObj>
       </w:sdtPr>
-      <w:sdtEndPr>
-        <w:rPr>
-          <w:rFonts w:eastAsiaTheme="minorHAnsi"/>
-          <w:lang w:eastAsia="en-US"/>
-        </w:rPr>
-      </w:sdtEndPr>
       <w:sdtContent>
         <w:p>
           <w:pPr>
@@ -28,7 +26,7 @@
             <mc:AlternateContent>
               <mc:Choice Requires="wpg">
                 <w:drawing>
-                  <wp:anchor distT="0" distB="0" distL="114300" distR="114300" simplePos="0" relativeHeight="251659264" behindDoc="1" locked="0" layoutInCell="1" allowOverlap="1">
+                  <wp:anchor distT="0" distB="0" distL="114300" distR="114300" simplePos="0" relativeHeight="251659264" behindDoc="1" locked="0" layoutInCell="1" allowOverlap="1" wp14:anchorId="30E510D2" wp14:editId="5EC31CE2">
                     <wp:simplePos x="0" y="0"/>
                     <mc:AlternateContent>
                       <mc:Choice Requires="wp14">
@@ -3433,7 +3431,7 @@
               </mc:Choice>
               <mc:Fallback>
                 <w:pict>
-                  <v:group id="Grupo 5" o:spid="_x0000_s1026" style="position:absolute;margin-left:0;margin-top:0;width:172.8pt;height:718.55pt;z-index:-251657216;mso-width-percent:330;mso-height-percent:950;mso-left-percent:40;mso-position-horizontal-relative:page;mso-position-vertical:center;mso-position-vertical-relative:page;mso-width-percent:330;mso-height-percent:950;mso-left-percent:40" coordsize="21945,91257" o:gfxdata="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">
+                  <v:group w14:anchorId="30E510D2" id="Grupo 5" o:spid="_x0000_s1026" style="position:absolute;margin-left:0;margin-top:0;width:172.8pt;height:718.55pt;z-index:-251657216;mso-width-percent:330;mso-height-percent:950;mso-left-percent:40;mso-position-horizontal-relative:page;mso-position-vertical:center;mso-position-vertical-relative:page;mso-width-percent:330;mso-height-percent:950;mso-left-percent:40" coordsize="21945,91257" o:gfxdata="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">
                     <v:rect id="Rectángulo 6" o:spid="_x0000_s1027" style="position:absolute;width:1945;height:91257;visibility:visible;mso-wrap-style:square;v-text-anchor:middle" o:gfxdata="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" fillcolor="#44546a [3215]" stroked="f" strokeweight="1pt"/>
                     <v:shapetype id="_x0000_t15" coordsize="21600,21600" o:spt="15" adj="16200" path="m@0,l,,,21600@0,21600,21600,10800xe">
                       <v:stroke joinstyle="miter"/>
@@ -3605,7 +3603,7 @@
             <mc:AlternateContent>
               <mc:Choice Requires="wps">
                 <w:drawing>
-                  <wp:anchor distT="0" distB="0" distL="114300" distR="114300" simplePos="0" relativeHeight="251661312" behindDoc="0" locked="0" layoutInCell="1" allowOverlap="1">
+                  <wp:anchor distT="0" distB="0" distL="114300" distR="114300" simplePos="0" relativeHeight="251661312" behindDoc="0" locked="0" layoutInCell="1" allowOverlap="1" wp14:anchorId="7E37E6B6" wp14:editId="419AC170">
                     <wp:simplePos x="0" y="0"/>
                     <mc:AlternateContent>
                       <mc:Choice Requires="wp14">
@@ -3699,7 +3697,7 @@
                                         <w:sz w:val="26"/>
                                         <w:szCs w:val="26"/>
                                       </w:rPr>
-                                      <w:t>SUMMER CAMP 2025</w:t>
+                                      <w:t>SUMMER CAMP 25</w:t>
                                     </w:r>
                                   </w:sdtContent>
                                 </w:sdt>
@@ -3771,11 +3769,11 @@
               </mc:Choice>
               <mc:Fallback>
                 <w:pict>
-                  <v:shapetype id="_x0000_t202" coordsize="21600,21600" o:spt="202" path="m,l,21600r21600,l21600,xe">
+                  <v:shapetype w14:anchorId="7E37E6B6" id="_x0000_t202" coordsize="21600,21600" o:spt="202" path="m,l,21600r21600,l21600,xe">
                     <v:stroke joinstyle="miter"/>
                     <v:path gradientshapeok="t" o:connecttype="rect"/>
                   </v:shapetype>
-                  <v:shape id="Cuadro de texto 34" o:spid="_x0000_s1055" type="#_x0000_t202" style="position:absolute;margin-left:0;margin-top:0;width:4in;height:28.8pt;z-index:251661312;visibility:visible;mso-wrap-style:square;mso-width-percent:450;mso-height-percent:0;mso-left-percent:420;mso-top-percent:880;mso-wrap-distance-left:9pt;mso-wrap-distance-top:0;mso-wrap-distance-right:9pt;mso-wrap-distance-bottom:0;mso-position-horizontal-relative:page;mso-position-vertical-relative:page;mso-width-percent:450;mso-height-percent:0;mso-left-percent:420;mso-top-percent:880;mso-width-relative:page;mso-height-relative:margin;v-text-anchor:bottom" o:gfxdata="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" filled="f" stroked="f" strokeweight=".5pt">
+                  <v:shape id="Cuadro de texto 34" o:spid="_x0000_s1055" type="#_x0000_t202" style="position:absolute;margin-left:0;margin-top:0;width:4in;height:28.8pt;z-index:251661312;visibility:visible;mso-wrap-style:square;mso-width-percent:450;mso-height-percent:0;mso-left-percent:420;mso-top-percent:880;mso-wrap-distance-left:9pt;mso-wrap-distance-top:0;mso-wrap-distance-right:9pt;mso-wrap-distance-bottom:0;mso-position-horizontal-relative:page;mso-position-vertical-relative:page;mso-width-percent:450;mso-height-percent:0;mso-left-percent:420;mso-top-percent:880;mso-width-relative:page;mso-height-relative:margin;v-text-anchor:bottom" o:gfxdata="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" filled="f" stroked="f" strokeweight=".5pt">
                     <v:textbox style="mso-fit-shape-to-text:t" inset="0,0,0,0">
                       <w:txbxContent>
                         <w:p>
@@ -3807,7 +3805,7 @@
                                   <w:sz w:val="26"/>
                                   <w:szCs w:val="26"/>
                                 </w:rPr>
-                                <w:t>SUMMER CAMP 2025</w:t>
+                                <w:t>SUMMER CAMP 25</w:t>
                               </w:r>
                             </w:sdtContent>
                           </w:sdt>
@@ -3872,7 +3870,7 @@
             <mc:AlternateContent>
               <mc:Choice Requires="wps">
                 <w:drawing>
-                  <wp:anchor distT="0" distB="0" distL="114300" distR="114300" simplePos="0" relativeHeight="251660288" behindDoc="0" locked="0" layoutInCell="1" allowOverlap="1">
+                  <wp:anchor distT="0" distB="0" distL="114300" distR="114300" simplePos="0" relativeHeight="251660288" behindDoc="0" locked="0" layoutInCell="1" allowOverlap="1" wp14:anchorId="68FBC020" wp14:editId="1D066EAF">
                     <wp:simplePos x="0" y="0"/>
                     <mc:AlternateContent>
                       <mc:Choice Requires="wp14">
@@ -4029,7 +4027,7 @@
               </mc:Choice>
               <mc:Fallback>
                 <w:pict>
-                  <v:shape id="Cuadro de texto 35" o:spid="_x0000_s1056" type="#_x0000_t202" style="position:absolute;margin-left:0;margin-top:0;width:4in;height:84.25pt;z-index:251660288;visibility:visible;mso-wrap-style:square;mso-width-percent:450;mso-height-percent:0;mso-left-percent:420;mso-top-percent:175;mso-wrap-distance-left:9pt;mso-wrap-distance-top:0;mso-wrap-distance-right:9pt;mso-wrap-distance-bottom:0;mso-position-horizontal-relative:page;mso-position-vertical-relative:page;mso-width-percent:450;mso-height-percent:0;mso-left-percent:420;mso-top-percent:175;mso-width-relative:page;mso-height-relative:margin;v-text-anchor:top" o:gfxdata="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" filled="f" stroked="f" strokeweight=".5pt">
+                  <v:shape w14:anchorId="68FBC020" id="Cuadro de texto 35" o:spid="_x0000_s1056" type="#_x0000_t202" style="position:absolute;margin-left:0;margin-top:0;width:4in;height:84.25pt;z-index:251660288;visibility:visible;mso-wrap-style:square;mso-width-percent:450;mso-height-percent:0;mso-left-percent:420;mso-top-percent:175;mso-wrap-distance-left:9pt;mso-wrap-distance-top:0;mso-wrap-distance-right:9pt;mso-wrap-distance-bottom:0;mso-position-horizontal-relative:page;mso-position-vertical-relative:page;mso-width-percent:450;mso-height-percent:0;mso-left-percent:420;mso-top-percent:175;mso-width-relative:page;mso-height-relative:margin;v-text-anchor:top" o:gfxdata="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" filled="f" stroked="f" strokeweight=".5pt">
                     <v:textbox style="mso-fit-shape-to-text:t" inset="0,0,0,0">
                       <w:txbxContent>
                         <w:p>
@@ -4116,8 +4114,6 @@
             <w:br w:type="page"/>
           </w:r>
         </w:p>
-        <w:bookmarkStart w:id="0" w:name="_GoBack" w:displacedByCustomXml="next"/>
-        <w:bookmarkEnd w:id="0" w:displacedByCustomXml="next"/>
       </w:sdtContent>
     </w:sdt>
     <w:p>
@@ -15846,7 +15842,7 @@
           <w:lang w:eastAsia="es-ES"/>
         </w:rPr>
         <w:drawing>
-          <wp:inline distT="0" distB="0" distL="0" distR="0" wp14:anchorId="1D9942D8" wp14:editId="1BA60880">
+          <wp:inline distT="0" distB="0" distL="0" distR="0" wp14:anchorId="1AD0E7FF" wp14:editId="290485EF">
             <wp:extent cx="5391150" cy="3013710"/>
             <wp:effectExtent l="0" t="0" r="0" b="0"/>
             <wp:docPr id="1" name="Imagen 1"/>
@@ -15911,7 +15907,7 @@
           <w:lang w:eastAsia="es-ES"/>
         </w:rPr>
         <w:drawing>
-          <wp:inline distT="0" distB="0" distL="0" distR="0" wp14:anchorId="4BA0DA89" wp14:editId="74EC90E9">
+          <wp:inline distT="0" distB="0" distL="0" distR="0" wp14:anchorId="3151B7DE" wp14:editId="2707803D">
             <wp:extent cx="5398770" cy="1749425"/>
             <wp:effectExtent l="0" t="0" r="0" b="3175"/>
             <wp:docPr id="2" name="Imagen 2"/>
@@ -15983,7 +15979,7 @@
           <w:lang w:eastAsia="es-ES"/>
         </w:rPr>
         <w:drawing>
-          <wp:inline distT="0" distB="0" distL="0" distR="0">
+          <wp:inline distT="0" distB="0" distL="0" distR="0" wp14:anchorId="65CF6DAA" wp14:editId="056C5BA5">
             <wp:extent cx="4905954" cy="1698214"/>
             <wp:effectExtent l="0" t="0" r="0" b="0"/>
             <wp:docPr id="4" name="Imagen 4"/>
@@ -16042,10 +16038,7 @@
         <w:jc w:val="center"/>
       </w:pPr>
       <w:r>
-        <w:t xml:space="preserve">Diagrama de actividad de </w:t>
-      </w:r>
-      <w:r>
-        <w:t>vista de un listado de edificio.</w:t>
+        <w:t>Diagrama de actividad de vista de un listado de edificio.</w:t>
       </w:r>
     </w:p>
     <w:sectPr>
@@ -16061,7 +16054,7 @@
 </file>
 
 <file path=word/numbering.xml><?xml version="1.0" encoding="utf-8"?>
-<w:numbering xmlns:wpc="http://schemas.microsoft.com/office/word/2010/wordprocessingCanvas" xmlns:cx="http://schemas.microsoft.com/office/drawing/2014/chartex" xmlns:cx1="http://schemas.microsoft.com/office/drawing/2015/9/8/chartex" xmlns:mc="http://schemas.openxmlformats.org/markup-compatibility/2006" xmlns:o="urn:schemas-microsoft-com:office:office" xmlns:r="http://schemas.openxmlformats.org/officeDocument/2006/relationships" xmlns:m="http://schemas.openxmlformats.org/officeDocument/2006/math" xmlns:v="urn:schemas-microsoft-com:vml" xmlns:wp14="http://schemas.microsoft.com/office/word/2010/wordprocessingDrawing" xmlns:wp="http://schemas.openxmlformats.org/drawingml/2006/wordprocessingDrawing" xmlns:w10="urn:schemas-microsoft-com:office:word" xmlns:w="http://schemas.openxmlformats.org/wordprocessingml/2006/main" xmlns:w14="http://schemas.microsoft.com/office/word/2010/wordml" xmlns:w15="http://schemas.microsoft.com/office/word/2012/wordml" xmlns:w16se="http://schemas.microsoft.com/office/word/2015/wordml/symex" xmlns:wpg="http://schemas.microsoft.com/office/word/2010/wordprocessingGroup" xmlns:wpi="http://schemas.microsoft.com/office/word/2010/wordprocessingInk" xmlns:wne="http://schemas.microsoft.com/office/word/2006/wordml" xmlns:wps="http://schemas.microsoft.com/office/word/2010/wordprocessingShape" mc:Ignorable="w14 w15 w16se wp14">
+<w:numbering xmlns:wpc="http://schemas.microsoft.com/office/word/2010/wordprocessingCanvas" xmlns:cx="http://schemas.microsoft.com/office/drawing/2014/chartex" xmlns:cx1="http://schemas.microsoft.com/office/drawing/2015/9/8/chartex" xmlns:cx2="http://schemas.microsoft.com/office/drawing/2015/10/21/chartex" xmlns:cx3="http://schemas.microsoft.com/office/drawing/2016/5/9/chartex" xmlns:cx4="http://schemas.microsoft.com/office/drawing/2016/5/10/chartex" xmlns:cx5="http://schemas.microsoft.com/office/drawing/2016/5/11/chartex" xmlns:cx6="http://schemas.microsoft.com/office/drawing/2016/5/12/chartex" xmlns:cx7="http://schemas.microsoft.com/office/drawing/2016/5/13/chartex" xmlns:cx8="http://schemas.microsoft.com/office/drawing/2016/5/14/chartex" xmlns:mc="http://schemas.openxmlformats.org/markup-compatibility/2006" xmlns:aink="http://schemas.microsoft.com/office/drawing/2016/ink" xmlns:am3d="http://schemas.microsoft.com/office/drawing/2017/model3d" xmlns:o="urn:schemas-microsoft-com:office:office" xmlns:oel="http://schemas.microsoft.com/office/2019/extlst" xmlns:r="http://schemas.openxmlformats.org/officeDocument/2006/relationships" xmlns:m="http://schemas.openxmlformats.org/officeDocument/2006/math" xmlns:v="urn:schemas-microsoft-com:vml" xmlns:wp14="http://schemas.microsoft.com/office/word/2010/wordprocessingDrawing" xmlns:wp="http://schemas.openxmlformats.org/drawingml/2006/wordprocessingDrawing" xmlns:w10="urn:schemas-microsoft-com:office:word" xmlns:w="http://schemas.openxmlformats.org/wordprocessingml/2006/main" xmlns:w14="http://schemas.microsoft.com/office/word/2010/wordml" xmlns:w15="http://schemas.microsoft.com/office/word/2012/wordml" xmlns:w16cex="http://schemas.microsoft.com/office/word/2018/wordml/cex" xmlns:w16cid="http://schemas.microsoft.com/office/word/2016/wordml/cid" xmlns:w16="http://schemas.microsoft.com/office/word/2018/wordml" xmlns:w16sdtdh="http://schemas.microsoft.com/office/word/2020/wordml/sdtdatahash" xmlns:w16se="http://schemas.microsoft.com/office/word/2015/wordml/symex" xmlns:wpg="http://schemas.microsoft.com/office/word/2010/wordprocessingGroup" xmlns:wpi="http://schemas.microsoft.com/office/word/2010/wordprocessingInk" xmlns:wne="http://schemas.microsoft.com/office/word/2006/wordml" xmlns:wps="http://schemas.microsoft.com/office/word/2010/wordprocessingShape" mc:Ignorable="w14 w15 w16se w16cid w16 w16cex w16sdtdh wp14">
   <w:abstractNum w:abstractNumId="0" w15:restartNumberingAfterBreak="0">
     <w:nsid w:val="07336A8C"/>
     <w:multiLevelType w:val="hybridMultilevel"/>
@@ -19124,92 +19117,92 @@
       </w:rPr>
     </w:lvl>
   </w:abstractNum>
-  <w:num w:numId="1">
+  <w:num w:numId="1" w16cid:durableId="534583739">
     <w:abstractNumId w:val="3"/>
   </w:num>
-  <w:num w:numId="2">
+  <w:num w:numId="2" w16cid:durableId="1093282589">
     <w:abstractNumId w:val="23"/>
   </w:num>
-  <w:num w:numId="3">
+  <w:num w:numId="3" w16cid:durableId="2060939076">
     <w:abstractNumId w:val="12"/>
   </w:num>
-  <w:num w:numId="4">
+  <w:num w:numId="4" w16cid:durableId="216011227">
     <w:abstractNumId w:val="7"/>
   </w:num>
-  <w:num w:numId="5">
+  <w:num w:numId="5" w16cid:durableId="1399014562">
     <w:abstractNumId w:val="17"/>
   </w:num>
-  <w:num w:numId="6">
+  <w:num w:numId="6" w16cid:durableId="1657802385">
     <w:abstractNumId w:val="18"/>
   </w:num>
-  <w:num w:numId="7">
+  <w:num w:numId="7" w16cid:durableId="1500388891">
     <w:abstractNumId w:val="24"/>
   </w:num>
-  <w:num w:numId="8">
+  <w:num w:numId="8" w16cid:durableId="867523991">
     <w:abstractNumId w:val="9"/>
   </w:num>
-  <w:num w:numId="9">
+  <w:num w:numId="9" w16cid:durableId="1259024919">
     <w:abstractNumId w:val="1"/>
   </w:num>
-  <w:num w:numId="10">
+  <w:num w:numId="10" w16cid:durableId="41486502">
     <w:abstractNumId w:val="16"/>
   </w:num>
-  <w:num w:numId="11">
+  <w:num w:numId="11" w16cid:durableId="663437277">
     <w:abstractNumId w:val="25"/>
   </w:num>
-  <w:num w:numId="12">
+  <w:num w:numId="12" w16cid:durableId="1503593308">
     <w:abstractNumId w:val="8"/>
   </w:num>
-  <w:num w:numId="13">
+  <w:num w:numId="13" w16cid:durableId="1401975498">
     <w:abstractNumId w:val="21"/>
   </w:num>
-  <w:num w:numId="14">
+  <w:num w:numId="14" w16cid:durableId="1893884400">
     <w:abstractNumId w:val="15"/>
   </w:num>
-  <w:num w:numId="15">
+  <w:num w:numId="15" w16cid:durableId="1846095431">
     <w:abstractNumId w:val="20"/>
   </w:num>
-  <w:num w:numId="16">
+  <w:num w:numId="16" w16cid:durableId="274213183">
     <w:abstractNumId w:val="5"/>
   </w:num>
-  <w:num w:numId="17">
+  <w:num w:numId="17" w16cid:durableId="996955065">
     <w:abstractNumId w:val="26"/>
   </w:num>
-  <w:num w:numId="18">
+  <w:num w:numId="18" w16cid:durableId="750808856">
     <w:abstractNumId w:val="6"/>
   </w:num>
-  <w:num w:numId="19">
+  <w:num w:numId="19" w16cid:durableId="1121336469">
     <w:abstractNumId w:val="14"/>
   </w:num>
-  <w:num w:numId="20">
+  <w:num w:numId="20" w16cid:durableId="1840851031">
     <w:abstractNumId w:val="0"/>
   </w:num>
-  <w:num w:numId="21">
+  <w:num w:numId="21" w16cid:durableId="886792935">
     <w:abstractNumId w:val="4"/>
   </w:num>
-  <w:num w:numId="22">
+  <w:num w:numId="22" w16cid:durableId="1868248615">
     <w:abstractNumId w:val="2"/>
   </w:num>
-  <w:num w:numId="23">
+  <w:num w:numId="23" w16cid:durableId="333802391">
     <w:abstractNumId w:val="10"/>
   </w:num>
-  <w:num w:numId="24">
+  <w:num w:numId="24" w16cid:durableId="426584442">
     <w:abstractNumId w:val="13"/>
   </w:num>
-  <w:num w:numId="25">
+  <w:num w:numId="25" w16cid:durableId="241838161">
     <w:abstractNumId w:val="11"/>
   </w:num>
-  <w:num w:numId="26">
+  <w:num w:numId="26" w16cid:durableId="1137146829">
     <w:abstractNumId w:val="22"/>
   </w:num>
-  <w:num w:numId="27">
+  <w:num w:numId="27" w16cid:durableId="91903857">
     <w:abstractNumId w:val="19"/>
   </w:num>
 </w:numbering>
 </file>
 
 <file path=word/styles.xml><?xml version="1.0" encoding="utf-8"?>
-<w:styles xmlns:mc="http://schemas.openxmlformats.org/markup-compatibility/2006" xmlns:r="http://schemas.openxmlformats.org/officeDocument/2006/relationships" xmlns:w="http://schemas.openxmlformats.org/wordprocessingml/2006/main" xmlns:w14="http://schemas.microsoft.com/office/word/2010/wordml" xmlns:w15="http://schemas.microsoft.com/office/word/2012/wordml" xmlns:w16se="http://schemas.microsoft.com/office/word/2015/wordml/symex" mc:Ignorable="w14 w15 w16se">
+<w:styles xmlns:mc="http://schemas.openxmlformats.org/markup-compatibility/2006" xmlns:r="http://schemas.openxmlformats.org/officeDocument/2006/relationships" xmlns:w="http://schemas.openxmlformats.org/wordprocessingml/2006/main" xmlns:w14="http://schemas.microsoft.com/office/word/2010/wordml" xmlns:w15="http://schemas.microsoft.com/office/word/2012/wordml" xmlns:w16cex="http://schemas.microsoft.com/office/word/2018/wordml/cex" xmlns:w16cid="http://schemas.microsoft.com/office/word/2016/wordml/cid" xmlns:w16="http://schemas.microsoft.com/office/word/2018/wordml" xmlns:w16sdtdh="http://schemas.microsoft.com/office/word/2020/wordml/sdtdatahash" xmlns:w16se="http://schemas.microsoft.com/office/word/2015/wordml/symex" mc:Ignorable="w14 w15 w16se w16cid w16 w16cex w16sdtdh">
   <w:docDefaults>
     <w:rPrDefault>
       <w:rPr>
@@ -19225,7 +19218,7 @@
       </w:pPr>
     </w:pPrDefault>
   </w:docDefaults>
-  <w:latentStyles w:defLockedState="0" w:defUIPriority="99" w:defSemiHidden="0" w:defUnhideWhenUsed="0" w:defQFormat="0" w:count="371">
+  <w:latentStyles w:defLockedState="0" w:defUIPriority="99" w:defSemiHidden="0" w:defUnhideWhenUsed="0" w:defQFormat="0" w:count="376">
     <w:lsdException w:name="Normal" w:uiPriority="0" w:qFormat="1"/>
     <w:lsdException w:name="heading 1" w:uiPriority="9" w:qFormat="1"/>
     <w:lsdException w:name="heading 2" w:semiHidden="1" w:uiPriority="9" w:unhideWhenUsed="1" w:qFormat="1"/>
@@ -19597,6 +19590,11 @@
     <w:lsdException w:name="List Table 5 Dark Accent 6" w:uiPriority="50"/>
     <w:lsdException w:name="List Table 6 Colorful Accent 6" w:uiPriority="51"/>
     <w:lsdException w:name="List Table 7 Colorful Accent 6" w:uiPriority="52"/>
+    <w:lsdException w:name="Mention" w:semiHidden="1" w:unhideWhenUsed="1"/>
+    <w:lsdException w:name="Smart Hyperlink" w:semiHidden="1" w:unhideWhenUsed="1"/>
+    <w:lsdException w:name="Hashtag" w:semiHidden="1" w:unhideWhenUsed="1"/>
+    <w:lsdException w:name="Unresolved Mention" w:semiHidden="1" w:unhideWhenUsed="1"/>
+    <w:lsdException w:name="Smart Link" w:semiHidden="1" w:unhideWhenUsed="1"/>
   </w:latentStyles>
   <w:style w:type="paragraph" w:default="1" w:styleId="Normal">
     <w:name w:val="Normal"/>
@@ -19672,6 +19670,7 @@
   <w:style w:type="character" w:default="1" w:styleId="Fuentedeprrafopredeter">
     <w:name w:val="Default Paragraph Font"/>
     <w:uiPriority w:val="1"/>
+    <w:semiHidden/>
     <w:unhideWhenUsed/>
   </w:style>
   <w:style w:type="table" w:default="1" w:styleId="Tablanormal">

</xml_diff>